<commit_message>
Fix the lastest bugs.
</commit_message>
<xml_diff>
--- a/Documentation IP_IP_HOURRA (admin).docx
+++ b/Documentation IP_IP_HOURRA (admin).docx
@@ -137,11 +137,19 @@
       </w:r>
       <w:proofErr w:type="spellStart"/>
       <w:r>
-        <w:t>create_user</w:t>
+        <w:t>create_</w:t>
+      </w:r>
+      <w:proofErr w:type="gramStart"/>
+      <w:r>
+        <w:t>user</w:t>
       </w:r>
       <w:proofErr w:type="spellEnd"/>
       <w:r>
-        <w:t xml:space="preserve">(). </w:t>
+        <w:t>(</w:t>
+      </w:r>
+      <w:proofErr w:type="gramEnd"/>
+      <w:r>
+        <w:t xml:space="preserve">). </w:t>
       </w:r>
     </w:p>
     <w:p>
@@ -428,6 +436,63 @@
       <w:r>
         <w:lastRenderedPageBreak/>
         <w:drawing>
+          <wp:anchor distT="0" distB="0" distL="114300" distR="114300" simplePos="0" relativeHeight="251661312" behindDoc="0" locked="0" layoutInCell="1" allowOverlap="1" wp14:anchorId="19940819" wp14:editId="2CDB6457">
+            <wp:simplePos x="0" y="0"/>
+            <wp:positionH relativeFrom="column">
+              <wp:posOffset>3011382</wp:posOffset>
+            </wp:positionH>
+            <wp:positionV relativeFrom="paragraph">
+              <wp:posOffset>454871</wp:posOffset>
+            </wp:positionV>
+            <wp:extent cx="3375660" cy="1740535"/>
+            <wp:effectExtent l="0" t="0" r="0" b="0"/>
+            <wp:wrapSquare wrapText="bothSides"/>
+            <wp:docPr id="521455926" name="Image 1"/>
+            <wp:cNvGraphicFramePr>
+              <a:graphicFrameLocks xmlns:a="http://schemas.openxmlformats.org/drawingml/2006/main" noChangeAspect="1"/>
+            </wp:cNvGraphicFramePr>
+            <a:graphic xmlns:a="http://schemas.openxmlformats.org/drawingml/2006/main">
+              <a:graphicData uri="http://schemas.openxmlformats.org/drawingml/2006/picture">
+                <pic:pic xmlns:pic="http://schemas.openxmlformats.org/drawingml/2006/picture">
+                  <pic:nvPicPr>
+                    <pic:cNvPr id="521455926" name=""/>
+                    <pic:cNvPicPr/>
+                  </pic:nvPicPr>
+                  <pic:blipFill>
+                    <a:blip r:embed="rId9">
+                      <a:extLst>
+                        <a:ext uri="{28A0092B-C50C-407E-A947-70E740481C1C}">
+                          <a14:useLocalDpi xmlns:a14="http://schemas.microsoft.com/office/drawing/2010/main" val="0"/>
+                        </a:ext>
+                      </a:extLst>
+                    </a:blip>
+                    <a:stretch>
+                      <a:fillRect/>
+                    </a:stretch>
+                  </pic:blipFill>
+                  <pic:spPr>
+                    <a:xfrm>
+                      <a:off x="0" y="0"/>
+                      <a:ext cx="3375660" cy="1740535"/>
+                    </a:xfrm>
+                    <a:prstGeom prst="rect">
+                      <a:avLst/>
+                    </a:prstGeom>
+                  </pic:spPr>
+                </pic:pic>
+              </a:graphicData>
+            </a:graphic>
+            <wp14:sizeRelH relativeFrom="margin">
+              <wp14:pctWidth>0</wp14:pctWidth>
+            </wp14:sizeRelH>
+            <wp14:sizeRelV relativeFrom="margin">
+              <wp14:pctHeight>0</wp14:pctHeight>
+            </wp14:sizeRelV>
+          </wp:anchor>
+        </w:drawing>
+      </w:r>
+      <w:r>
+        <w:drawing>
           <wp:anchor distT="0" distB="0" distL="114300" distR="114300" simplePos="0" relativeHeight="251659264" behindDoc="0" locked="0" layoutInCell="1" allowOverlap="1" wp14:anchorId="694B1629" wp14:editId="56068718">
             <wp:simplePos x="0" y="0"/>
             <wp:positionH relativeFrom="page">
@@ -451,7 +516,7 @@
                     <pic:cNvPicPr/>
                   </pic:nvPicPr>
                   <pic:blipFill>
-                    <a:blip r:embed="rId9" cstate="print">
+                    <a:blip r:embed="rId10" cstate="print">
                       <a:extLst>
                         <a:ext uri="{28A0092B-C50C-407E-A947-70E740481C1C}">
                           <a14:useLocalDpi xmlns:a14="http://schemas.microsoft.com/office/drawing/2010/main" val="0"/>
@@ -484,19 +549,69 @@
         </w:drawing>
       </w:r>
       <w:r>
+        <w:rPr>
+          <w:noProof/>
+        </w:rPr>
+        <w:t xml:space="preserve"> </w:t>
+      </w:r>
+      <w:r>
+        <w:t>Si vous validez par 0, alors il vous affiche cette interface</w:t>
+      </w:r>
+      <w:r>
+        <w:t xml:space="preserve"> en créant une connexion. </w:t>
+      </w:r>
+    </w:p>
+    <w:p/>
+    <w:p/>
+    <w:p>
+      <w:r>
+        <w:t xml:space="preserve">Le début de la connexion se fait via la méthode </w:t>
+      </w:r>
+      <w:r>
+        <w:rPr>
+          <w:b/>
+          <w:bCs/>
+        </w:rPr>
+        <w:t>login</w:t>
+      </w:r>
+      <w:r>
+        <w:t xml:space="preserve"> via l’instance de la classe Login et avec come argument le type de connexion (admin ou user car admin peut créer des utilisateurs tandis que les utilisateurs ne peuvent que se connecter). </w:t>
+      </w:r>
+    </w:p>
+    <w:p>
+      <w:r>
+        <w:t xml:space="preserve">La méthode </w:t>
+      </w:r>
+      <w:r>
+        <w:rPr>
+          <w:b/>
+          <w:bCs/>
+        </w:rPr>
+        <w:t>login</w:t>
+      </w:r>
+      <w:r>
+        <w:t xml:space="preserve"> permet de se connecter mais aussi de retenir s’il s’agit d’un administrateur ou d’un </w:t>
+      </w:r>
+      <w:r>
+        <w:t>utilisateur</w:t>
+      </w:r>
+      <w:r>
+        <w:t xml:space="preserve">. </w:t>
+      </w:r>
+      <w:r>
+        <w:t>Si le type de connexion est admin, alors le fichier à analyser est « datas/admin.dat »</w:t>
+      </w:r>
+      <w:r>
+        <w:t xml:space="preserve"> afin de vérifier si la personne entre les bonnes informations. </w:t>
+      </w:r>
+    </w:p>
+    <w:p>
+      <w:r>
         <w:drawing>
-          <wp:anchor distT="0" distB="0" distL="114300" distR="114300" simplePos="0" relativeHeight="251661312" behindDoc="0" locked="0" layoutInCell="1" allowOverlap="1" wp14:anchorId="15056F21" wp14:editId="27A23C32">
-            <wp:simplePos x="0" y="0"/>
-            <wp:positionH relativeFrom="column">
-              <wp:posOffset>3088005</wp:posOffset>
-            </wp:positionH>
-            <wp:positionV relativeFrom="paragraph">
-              <wp:posOffset>369570</wp:posOffset>
-            </wp:positionV>
-            <wp:extent cx="3343910" cy="1819910"/>
-            <wp:effectExtent l="0" t="0" r="8890" b="8890"/>
-            <wp:wrapSquare wrapText="bothSides"/>
-            <wp:docPr id="207250097" name="Image 1"/>
+          <wp:inline distT="0" distB="0" distL="0" distR="0" wp14:anchorId="0B5DE2A1" wp14:editId="2BCBF8C1">
+            <wp:extent cx="4153260" cy="3337849"/>
+            <wp:effectExtent l="0" t="0" r="0" b="0"/>
+            <wp:docPr id="418777746" name="Image 1"/>
             <wp:cNvGraphicFramePr>
               <a:graphicFrameLocks xmlns:a="http://schemas.openxmlformats.org/drawingml/2006/main" noChangeAspect="1"/>
             </wp:cNvGraphicFramePr>
@@ -504,17 +619,11 @@
               <a:graphicData uri="http://schemas.openxmlformats.org/drawingml/2006/picture">
                 <pic:pic xmlns:pic="http://schemas.openxmlformats.org/drawingml/2006/picture">
                   <pic:nvPicPr>
-                    <pic:cNvPr id="207250097" name=""/>
+                    <pic:cNvPr id="418777746" name=""/>
                     <pic:cNvPicPr/>
                   </pic:nvPicPr>
                   <pic:blipFill>
-                    <a:blip r:embed="rId10">
-                      <a:extLst>
-                        <a:ext uri="{28A0092B-C50C-407E-A947-70E740481C1C}">
-                          <a14:useLocalDpi xmlns:a14="http://schemas.microsoft.com/office/drawing/2010/main" val="0"/>
-                        </a:ext>
-                      </a:extLst>
-                    </a:blip>
+                    <a:blip r:embed="rId11"/>
                     <a:stretch>
                       <a:fillRect/>
                     </a:stretch>
@@ -522,134 +631,7 @@
                   <pic:spPr>
                     <a:xfrm>
                       <a:off x="0" y="0"/>
-                      <a:ext cx="3343910" cy="1819910"/>
-                    </a:xfrm>
-                    <a:prstGeom prst="rect">
-                      <a:avLst/>
-                    </a:prstGeom>
-                  </pic:spPr>
-                </pic:pic>
-              </a:graphicData>
-            </a:graphic>
-          </wp:anchor>
-        </w:drawing>
-      </w:r>
-      <w:r>
-        <w:t>Si vous validez par 0, alors il vous affiche cette interface</w:t>
-      </w:r>
-      <w:r>
-        <w:t xml:space="preserve"> en créant une connexion. </w:t>
-      </w:r>
-    </w:p>
-    <w:p/>
-    <w:p/>
-    <w:p/>
-    <w:p>
-      <w:r>
-        <w:t xml:space="preserve">Le début de la connexion se fait via la méthode </w:t>
-      </w:r>
-      <w:proofErr w:type="spellStart"/>
-      <w:r>
-        <w:t>start_login</w:t>
-      </w:r>
-      <w:proofErr w:type="spellEnd"/>
-      <w:r>
-        <w:t xml:space="preserve"> via l’instance de la classe Login et avec come argument le type de connexion (admin ou user car admin peut créer des utilisateurs tandis que les utilisateurs ne peuvent que se connecter). </w:t>
-      </w:r>
-    </w:p>
-    <w:p/>
-    <w:p/>
-    <w:p/>
-    <w:p/>
-    <w:p/>
-    <w:p/>
-    <w:p/>
-    <w:p/>
-    <w:p/>
-    <w:p/>
-    <w:p>
-      <w:r>
-        <w:lastRenderedPageBreak/>
-        <w:drawing>
-          <wp:anchor distT="0" distB="0" distL="114300" distR="114300" simplePos="0" relativeHeight="251658240" behindDoc="0" locked="0" layoutInCell="1" allowOverlap="1" wp14:anchorId="5AD03831" wp14:editId="5DF07153">
-            <wp:simplePos x="0" y="0"/>
-            <wp:positionH relativeFrom="margin">
-              <wp:posOffset>-76200</wp:posOffset>
-            </wp:positionH>
-            <wp:positionV relativeFrom="paragraph">
-              <wp:posOffset>208703</wp:posOffset>
-            </wp:positionV>
-            <wp:extent cx="3378835" cy="2227580"/>
-            <wp:effectExtent l="0" t="0" r="0" b="1270"/>
-            <wp:wrapSquare wrapText="bothSides"/>
-            <wp:docPr id="853934487" name="Image 1"/>
-            <wp:cNvGraphicFramePr>
-              <a:graphicFrameLocks xmlns:a="http://schemas.openxmlformats.org/drawingml/2006/main" noChangeAspect="1"/>
-            </wp:cNvGraphicFramePr>
-            <a:graphic xmlns:a="http://schemas.openxmlformats.org/drawingml/2006/main">
-              <a:graphicData uri="http://schemas.openxmlformats.org/drawingml/2006/picture">
-                <pic:pic xmlns:pic="http://schemas.openxmlformats.org/drawingml/2006/picture">
-                  <pic:nvPicPr>
-                    <pic:cNvPr id="853934487" name=""/>
-                    <pic:cNvPicPr/>
-                  </pic:nvPicPr>
-                  <pic:blipFill>
-                    <a:blip r:embed="rId11" cstate="print">
-                      <a:extLst>
-                        <a:ext uri="{28A0092B-C50C-407E-A947-70E740481C1C}">
-                          <a14:useLocalDpi xmlns:a14="http://schemas.microsoft.com/office/drawing/2010/main" val="0"/>
-                        </a:ext>
-                      </a:extLst>
-                    </a:blip>
-                    <a:stretch>
-                      <a:fillRect/>
-                    </a:stretch>
-                  </pic:blipFill>
-                  <pic:spPr>
-                    <a:xfrm>
-                      <a:off x="0" y="0"/>
-                      <a:ext cx="3378835" cy="2227580"/>
-                    </a:xfrm>
-                    <a:prstGeom prst="rect">
-                      <a:avLst/>
-                    </a:prstGeom>
-                  </pic:spPr>
-                </pic:pic>
-              </a:graphicData>
-            </a:graphic>
-          </wp:anchor>
-        </w:drawing>
-      </w:r>
-    </w:p>
-    <w:p/>
-    <w:p/>
-    <w:p>
-      <w:r>
-        <w:drawing>
-          <wp:inline distT="0" distB="0" distL="0" distR="0" wp14:anchorId="0258819E" wp14:editId="18714CCA">
-            <wp:extent cx="4709568" cy="3475021"/>
-            <wp:effectExtent l="0" t="0" r="0" b="0"/>
-            <wp:docPr id="1925331358" name="Image 1"/>
-            <wp:cNvGraphicFramePr>
-              <a:graphicFrameLocks xmlns:a="http://schemas.openxmlformats.org/drawingml/2006/main" noChangeAspect="1"/>
-            </wp:cNvGraphicFramePr>
-            <a:graphic xmlns:a="http://schemas.openxmlformats.org/drawingml/2006/main">
-              <a:graphicData uri="http://schemas.openxmlformats.org/drawingml/2006/picture">
-                <pic:pic xmlns:pic="http://schemas.openxmlformats.org/drawingml/2006/picture">
-                  <pic:nvPicPr>
-                    <pic:cNvPr id="1925331358" name=""/>
-                    <pic:cNvPicPr/>
-                  </pic:nvPicPr>
-                  <pic:blipFill>
-                    <a:blip r:embed="rId12"/>
-                    <a:stretch>
-                      <a:fillRect/>
-                    </a:stretch>
-                  </pic:blipFill>
-                  <pic:spPr>
-                    <a:xfrm>
-                      <a:off x="0" y="0"/>
-                      <a:ext cx="4709568" cy="3475021"/>
+                      <a:ext cx="4153260" cy="3337849"/>
                     </a:xfrm>
                     <a:prstGeom prst="rect">
                       <a:avLst/>
@@ -661,17 +643,9 @@
           </wp:inline>
         </w:drawing>
       </w:r>
-    </w:p>
-    <w:p/>
-    <w:p>
-      <w:r>
-        <w:t xml:space="preserve">Une fois le mot de passe modifié, l’application vous transporte directement vers la page de connexion pour l’administrateur. </w:t>
-      </w:r>
-    </w:p>
-    <w:p>
       <w:r>
         <w:drawing>
-          <wp:inline distT="0" distB="0" distL="0" distR="0" wp14:anchorId="3BD9BA3B" wp14:editId="2ACA3DE1">
+          <wp:inline distT="0" distB="0" distL="0" distR="0" wp14:anchorId="5CA58888" wp14:editId="5573A15F">
             <wp:extent cx="2872989" cy="1409822"/>
             <wp:effectExtent l="0" t="0" r="3810" b="0"/>
             <wp:docPr id="1228507251" name="Image 1"/>
@@ -686,7 +660,7 @@
                     <pic:cNvPicPr/>
                   </pic:nvPicPr>
                   <pic:blipFill>
-                    <a:blip r:embed="rId13"/>
+                    <a:blip r:embed="rId12"/>
                     <a:stretch>
                       <a:fillRect/>
                     </a:stretch>
@@ -707,6 +681,233 @@
         </w:drawing>
       </w:r>
     </w:p>
+    <w:p>
+      <w:r>
+        <w:lastRenderedPageBreak/>
+        <w:t xml:space="preserve">Par la suite la vérification se fait en lisant les différentes lignes du fichier (un en l’occurrence car il n’y a qu’un seul admin) et compare la première partie de la ligne avec le mot de passe </w:t>
+      </w:r>
+      <w:proofErr w:type="spellStart"/>
+      <w:r>
+        <w:t>hashé</w:t>
+      </w:r>
+      <w:proofErr w:type="spellEnd"/>
+      <w:r>
+        <w:t xml:space="preserve"> et </w:t>
+      </w:r>
+      <w:proofErr w:type="spellStart"/>
+      <w:r>
+        <w:t>et</w:t>
+      </w:r>
+      <w:proofErr w:type="spellEnd"/>
+      <w:r>
+        <w:t xml:space="preserve"> le mot de passe </w:t>
+      </w:r>
+      <w:proofErr w:type="spellStart"/>
+      <w:r>
+        <w:t>hashé</w:t>
+      </w:r>
+      <w:proofErr w:type="spellEnd"/>
+      <w:r>
+        <w:t xml:space="preserve"> enregistré. Puis elle compare également le nom d’admin enregistré avec celui entré par le client. </w:t>
+      </w:r>
+    </w:p>
+    <w:p>
+      <w:r>
+        <w:drawing>
+          <wp:inline distT="0" distB="0" distL="0" distR="0" wp14:anchorId="40F3D734" wp14:editId="7FBE60AA">
+            <wp:extent cx="5760720" cy="3739515"/>
+            <wp:effectExtent l="0" t="0" r="0" b="0"/>
+            <wp:docPr id="1965261213" name="Image 1"/>
+            <wp:cNvGraphicFramePr>
+              <a:graphicFrameLocks xmlns:a="http://schemas.openxmlformats.org/drawingml/2006/main" noChangeAspect="1"/>
+            </wp:cNvGraphicFramePr>
+            <a:graphic xmlns:a="http://schemas.openxmlformats.org/drawingml/2006/main">
+              <a:graphicData uri="http://schemas.openxmlformats.org/drawingml/2006/picture">
+                <pic:pic xmlns:pic="http://schemas.openxmlformats.org/drawingml/2006/picture">
+                  <pic:nvPicPr>
+                    <pic:cNvPr id="1965261213" name=""/>
+                    <pic:cNvPicPr/>
+                  </pic:nvPicPr>
+                  <pic:blipFill>
+                    <a:blip r:embed="rId13"/>
+                    <a:stretch>
+                      <a:fillRect/>
+                    </a:stretch>
+                  </pic:blipFill>
+                  <pic:spPr>
+                    <a:xfrm>
+                      <a:off x="0" y="0"/>
+                      <a:ext cx="5760720" cy="3739515"/>
+                    </a:xfrm>
+                    <a:prstGeom prst="rect">
+                      <a:avLst/>
+                    </a:prstGeom>
+                  </pic:spPr>
+                </pic:pic>
+              </a:graphicData>
+            </a:graphic>
+          </wp:inline>
+        </w:drawing>
+      </w:r>
+    </w:p>
+    <w:p/>
+    <w:p>
+      <w:pPr>
+        <w:rPr>
+          <w:b/>
+          <w:bCs/>
+        </w:rPr>
+      </w:pPr>
+      <w:r>
+        <w:t xml:space="preserve">En cas d’échec il y a un compteur de mauvaise connexion qui incrémente jusque 2 et réinitialise à 0. Si le nombre de mauvaise connexion est égal à 2, alors on appelle la méthode </w:t>
+      </w:r>
+      <w:proofErr w:type="spellStart"/>
+      <w:r>
+        <w:rPr>
+          <w:b/>
+          <w:bCs/>
+        </w:rPr>
+        <w:t>change_forgotten_password</w:t>
+      </w:r>
+      <w:proofErr w:type="spellEnd"/>
+      <w:r>
+        <w:rPr>
+          <w:b/>
+          <w:bCs/>
+        </w:rPr>
+        <w:t>.</w:t>
+      </w:r>
+    </w:p>
+    <w:p>
+      <w:pPr>
+        <w:rPr>
+          <w:b/>
+          <w:bCs/>
+        </w:rPr>
+      </w:pPr>
+      <w:r>
+        <w:drawing>
+          <wp:anchor distT="0" distB="0" distL="114300" distR="114300" simplePos="0" relativeHeight="251665408" behindDoc="0" locked="0" layoutInCell="1" allowOverlap="1" wp14:anchorId="3306C3E3" wp14:editId="5E31B5AE">
+            <wp:simplePos x="0" y="0"/>
+            <wp:positionH relativeFrom="margin">
+              <wp:align>center</wp:align>
+            </wp:positionH>
+            <wp:positionV relativeFrom="paragraph">
+              <wp:posOffset>135044</wp:posOffset>
+            </wp:positionV>
+            <wp:extent cx="3978910" cy="2623185"/>
+            <wp:effectExtent l="0" t="0" r="2540" b="5715"/>
+            <wp:wrapSquare wrapText="bothSides"/>
+            <wp:docPr id="853934487" name="Image 1"/>
+            <wp:cNvGraphicFramePr>
+              <a:graphicFrameLocks xmlns:a="http://schemas.openxmlformats.org/drawingml/2006/main" noChangeAspect="1"/>
+            </wp:cNvGraphicFramePr>
+            <a:graphic xmlns:a="http://schemas.openxmlformats.org/drawingml/2006/main">
+              <a:graphicData uri="http://schemas.openxmlformats.org/drawingml/2006/picture">
+                <pic:pic xmlns:pic="http://schemas.openxmlformats.org/drawingml/2006/picture">
+                  <pic:nvPicPr>
+                    <pic:cNvPr id="853934487" name=""/>
+                    <pic:cNvPicPr/>
+                  </pic:nvPicPr>
+                  <pic:blipFill>
+                    <a:blip r:embed="rId14" cstate="print">
+                      <a:extLst>
+                        <a:ext uri="{28A0092B-C50C-407E-A947-70E740481C1C}">
+                          <a14:useLocalDpi xmlns:a14="http://schemas.microsoft.com/office/drawing/2010/main" val="0"/>
+                        </a:ext>
+                      </a:extLst>
+                    </a:blip>
+                    <a:stretch>
+                      <a:fillRect/>
+                    </a:stretch>
+                  </pic:blipFill>
+                  <pic:spPr>
+                    <a:xfrm>
+                      <a:off x="0" y="0"/>
+                      <a:ext cx="3978910" cy="2623185"/>
+                    </a:xfrm>
+                    <a:prstGeom prst="rect">
+                      <a:avLst/>
+                    </a:prstGeom>
+                  </pic:spPr>
+                </pic:pic>
+              </a:graphicData>
+            </a:graphic>
+            <wp14:sizeRelH relativeFrom="margin">
+              <wp14:pctWidth>0</wp14:pctWidth>
+            </wp14:sizeRelH>
+            <wp14:sizeRelV relativeFrom="margin">
+              <wp14:pctHeight>0</wp14:pctHeight>
+            </wp14:sizeRelV>
+          </wp:anchor>
+        </w:drawing>
+      </w:r>
+    </w:p>
+    <w:p/>
+    <w:p/>
+    <w:p/>
+    <w:p/>
+    <w:p/>
+    <w:p/>
+    <w:p/>
+    <w:p/>
+    <w:p>
+      <w:r>
+        <w:lastRenderedPageBreak/>
+        <w:t>Que fait la méthode</w:t>
+      </w:r>
+      <w:r>
+        <w:rPr>
+          <w:b/>
+          <w:bCs/>
+        </w:rPr>
+        <w:t xml:space="preserve"> </w:t>
+      </w:r>
+      <w:proofErr w:type="spellStart"/>
+      <w:r>
+        <w:rPr>
+          <w:b/>
+          <w:bCs/>
+        </w:rPr>
+        <w:t>change_forgotten_password</w:t>
+      </w:r>
+      <w:proofErr w:type="spellEnd"/>
+      <w:r>
+        <w:t> ?</w:t>
+      </w:r>
+    </w:p>
+    <w:p>
+      <w:r>
+        <w:t xml:space="preserve">Elle affiche le nom d’utilisateur concerné (car elle fonctionne également pour les </w:t>
+      </w:r>
+      <w:proofErr w:type="spellStart"/>
+      <w:r>
+        <w:t>users</w:t>
+      </w:r>
+      <w:proofErr w:type="spellEnd"/>
+      <w:r>
+        <w:t xml:space="preserve">) et demande un nouveau mot de passe. Puis elle met à jour le fichier à lire et à modifier (ici « datas/databases.dat ») et cherche la ligne où le nom de l’utilisateur / admin est inscrit et change le mot de passe (transformé) par le nouveau </w:t>
+      </w:r>
+      <w:proofErr w:type="spellStart"/>
+      <w:r>
+        <w:t>mdp</w:t>
+      </w:r>
+      <w:proofErr w:type="spellEnd"/>
+      <w:r>
+        <w:t xml:space="preserve"> qui est aussi transformé par l’algorithme SHA-256. La méthode ne réécrit pas tout le fichier, elle efface la ligne de l’utilisateur puis les changements se font à la fin du fichier.</w:t>
+      </w:r>
+    </w:p>
+    <w:p/>
+    <w:p/>
+    <w:p/>
+    <w:p>
+      <w:r>
+        <w:t xml:space="preserve">Une fois le mot de passe modifié, l’application vous transporte directement vers la page de connexion pour l’administrateur. </w:t>
+      </w:r>
+    </w:p>
+    <w:p/>
+    <w:p/>
+    <w:p/>
     <w:sectPr>
       <w:pgSz w:w="11906" w:h="16838"/>
       <w:pgMar w:top="1417" w:right="1417" w:bottom="1417" w:left="1417" w:header="708" w:footer="708" w:gutter="0"/>

</xml_diff>

<commit_message>
Final version without bugs.
</commit_message>
<xml_diff>
--- a/Documentation IP_IP_HOURRA (admin).docx
+++ b/Documentation IP_IP_HOURRA (admin).docx
@@ -894,20 +894,352 @@
       </w:r>
       <w:proofErr w:type="spellEnd"/>
       <w:r>
-        <w:t xml:space="preserve"> qui est aussi transformé par l’algorithme SHA-256. La méthode ne réécrit pas tout le fichier, elle efface la ligne de l’utilisateur puis les changements se font à la fin du fichier.</w:t>
-      </w:r>
-    </w:p>
-    <w:p/>
-    <w:p/>
+        <w:t xml:space="preserve"> qui est aussi transformé par l’algorithme SHA-256. La méthode ne réécrit pas tout le fichier, elle efface la ligne de l’utilisateur puis les changements se font à la fin du fichier</w:t>
+      </w:r>
+      <w:r>
+        <w:t xml:space="preserve"> de données.</w:t>
+      </w:r>
+    </w:p>
     <w:p/>
     <w:p>
       <w:r>
         <w:t xml:space="preserve">Une fois le mot de passe modifié, l’application vous transporte directement vers la page de connexion pour l’administrateur. </w:t>
       </w:r>
-    </w:p>
-    <w:p/>
-    <w:p/>
-    <w:p/>
+      <w:r>
+        <w:t xml:space="preserve">Et dès que vous vous êtes connecté(e), l’administrateur peut enfin ajouter un utilisateur. </w:t>
+      </w:r>
+    </w:p>
+    <w:p>
+      <w:r>
+        <w:drawing>
+          <wp:inline distT="0" distB="0" distL="0" distR="0" wp14:anchorId="7A9511FD" wp14:editId="742307AE">
+            <wp:extent cx="4792133" cy="2022077"/>
+            <wp:effectExtent l="0" t="0" r="8890" b="0"/>
+            <wp:docPr id="720333019" name="Image 1"/>
+            <wp:cNvGraphicFramePr>
+              <a:graphicFrameLocks xmlns:a="http://schemas.openxmlformats.org/drawingml/2006/main" noChangeAspect="1"/>
+            </wp:cNvGraphicFramePr>
+            <a:graphic xmlns:a="http://schemas.openxmlformats.org/drawingml/2006/main">
+              <a:graphicData uri="http://schemas.openxmlformats.org/drawingml/2006/picture">
+                <pic:pic xmlns:pic="http://schemas.openxmlformats.org/drawingml/2006/picture">
+                  <pic:nvPicPr>
+                    <pic:cNvPr id="720333019" name=""/>
+                    <pic:cNvPicPr/>
+                  </pic:nvPicPr>
+                  <pic:blipFill>
+                    <a:blip r:embed="rId15"/>
+                    <a:stretch>
+                      <a:fillRect/>
+                    </a:stretch>
+                  </pic:blipFill>
+                  <pic:spPr>
+                    <a:xfrm>
+                      <a:off x="0" y="0"/>
+                      <a:ext cx="4799891" cy="2025350"/>
+                    </a:xfrm>
+                    <a:prstGeom prst="rect">
+                      <a:avLst/>
+                    </a:prstGeom>
+                  </pic:spPr>
+                </pic:pic>
+              </a:graphicData>
+            </a:graphic>
+          </wp:inline>
+        </w:drawing>
+      </w:r>
+    </w:p>
+    <w:p>
+      <w:r>
+        <w:t xml:space="preserve">Un autre système de vérification est mis en place lorsque l’administrateur ajoute un utilisateur déjà existant. En effet, il est préférable de n’avoir qu’un seul car cela peut provoquer une erreur de lecture du fichier. Après cela, le programme emploie la méthode </w:t>
+      </w:r>
+      <w:proofErr w:type="spellStart"/>
+      <w:r>
+        <w:rPr>
+          <w:b/>
+          <w:bCs/>
+        </w:rPr>
+        <w:t>write_file</w:t>
+      </w:r>
+      <w:proofErr w:type="spellEnd"/>
+      <w:r>
+        <w:t xml:space="preserve"> pour écrire la nouvelle utilisatrice. </w:t>
+      </w:r>
+    </w:p>
+    <w:p>
+      <w:r>
+        <w:drawing>
+          <wp:inline distT="0" distB="0" distL="0" distR="0" wp14:anchorId="5AF9D555" wp14:editId="3D7A16F7">
+            <wp:extent cx="3338763" cy="2667000"/>
+            <wp:effectExtent l="0" t="0" r="0" b="0"/>
+            <wp:docPr id="1306858829" name="Image 1"/>
+            <wp:cNvGraphicFramePr>
+              <a:graphicFrameLocks xmlns:a="http://schemas.openxmlformats.org/drawingml/2006/main" noChangeAspect="1"/>
+            </wp:cNvGraphicFramePr>
+            <a:graphic xmlns:a="http://schemas.openxmlformats.org/drawingml/2006/main">
+              <a:graphicData uri="http://schemas.openxmlformats.org/drawingml/2006/picture">
+                <pic:pic xmlns:pic="http://schemas.openxmlformats.org/drawingml/2006/picture">
+                  <pic:nvPicPr>
+                    <pic:cNvPr id="1306858829" name=""/>
+                    <pic:cNvPicPr/>
+                  </pic:nvPicPr>
+                  <pic:blipFill>
+                    <a:blip r:embed="rId16"/>
+                    <a:stretch>
+                      <a:fillRect/>
+                    </a:stretch>
+                  </pic:blipFill>
+                  <pic:spPr>
+                    <a:xfrm>
+                      <a:off x="0" y="0"/>
+                      <a:ext cx="3346006" cy="2672786"/>
+                    </a:xfrm>
+                    <a:prstGeom prst="rect">
+                      <a:avLst/>
+                    </a:prstGeom>
+                  </pic:spPr>
+                </pic:pic>
+              </a:graphicData>
+            </a:graphic>
+          </wp:inline>
+        </w:drawing>
+      </w:r>
+    </w:p>
+    <w:p>
+      <w:pPr>
+        <w:pStyle w:val="Titre2"/>
+      </w:pPr>
+      <w:r>
+        <w:lastRenderedPageBreak/>
+        <w:t>Le fonctionnement entier de la création des utilisateurs</w:t>
+      </w:r>
+    </w:p>
+    <w:p/>
+    <w:p>
+      <w:r>
+        <w:t xml:space="preserve">Etant donné que les user et l’admin se ressemblent beaucoup, nous avons pensé à utiliser le design pattern </w:t>
+      </w:r>
+      <w:proofErr w:type="spellStart"/>
+      <w:r>
+        <w:t>Factory</w:t>
+      </w:r>
+      <w:proofErr w:type="spellEnd"/>
+      <w:r>
+        <w:t xml:space="preserve"> Method. </w:t>
+      </w:r>
+    </w:p>
+    <w:p>
+      <w:r>
+        <w:drawing>
+          <wp:inline distT="0" distB="0" distL="0" distR="0" wp14:anchorId="2AEB7454" wp14:editId="25DA8572">
+            <wp:extent cx="4785775" cy="3055885"/>
+            <wp:effectExtent l="0" t="0" r="0" b="0"/>
+            <wp:docPr id="67680844" name="Image 1"/>
+            <wp:cNvGraphicFramePr>
+              <a:graphicFrameLocks xmlns:a="http://schemas.openxmlformats.org/drawingml/2006/main" noChangeAspect="1"/>
+            </wp:cNvGraphicFramePr>
+            <a:graphic xmlns:a="http://schemas.openxmlformats.org/drawingml/2006/main">
+              <a:graphicData uri="http://schemas.openxmlformats.org/drawingml/2006/picture">
+                <pic:pic xmlns:pic="http://schemas.openxmlformats.org/drawingml/2006/picture">
+                  <pic:nvPicPr>
+                    <pic:cNvPr id="67680844" name=""/>
+                    <pic:cNvPicPr/>
+                  </pic:nvPicPr>
+                  <pic:blipFill>
+                    <a:blip r:embed="rId17"/>
+                    <a:stretch>
+                      <a:fillRect/>
+                    </a:stretch>
+                  </pic:blipFill>
+                  <pic:spPr>
+                    <a:xfrm>
+                      <a:off x="0" y="0"/>
+                      <a:ext cx="4785775" cy="3055885"/>
+                    </a:xfrm>
+                    <a:prstGeom prst="rect">
+                      <a:avLst/>
+                    </a:prstGeom>
+                  </pic:spPr>
+                </pic:pic>
+              </a:graphicData>
+            </a:graphic>
+          </wp:inline>
+        </w:drawing>
+      </w:r>
+    </w:p>
+    <w:p/>
+    <w:p>
+      <w:r>
+        <w:t xml:space="preserve">En effet, la classe Admin a comme attribut une dépendance avec la classe Security. Celle-ci permet de créer un mot de passe </w:t>
+      </w:r>
+      <w:proofErr w:type="spellStart"/>
+      <w:r>
+        <w:t>hashé</w:t>
+      </w:r>
+      <w:proofErr w:type="spellEnd"/>
+      <w:r>
+        <w:t xml:space="preserve"> et également d’écrire le nom d’administrateur root avec le mot de passe dans le fichier adéquat. </w:t>
+      </w:r>
+    </w:p>
+    <w:p/>
+    <w:p>
+      <w:r>
+        <w:t xml:space="preserve">Nous aurions pu faire la même chose avec la sous-classe User mais la classe Login possède également une dépendance avec la classe Security. De plus, il y a une méthode de vérification si le nom d’utilisateur existe déjà dans le fichier de données « datas/databases.dat ». </w:t>
+      </w:r>
+    </w:p>
+    <w:p/>
+    <w:p/>
+    <w:p/>
+    <w:p/>
+    <w:p/>
+    <w:p/>
+    <w:p/>
+    <w:p>
+      <w:pPr>
+        <w:pStyle w:val="Titre2"/>
+      </w:pPr>
+      <w:r>
+        <w:lastRenderedPageBreak/>
+        <w:t xml:space="preserve">Démonstration du design pattern </w:t>
+      </w:r>
+    </w:p>
+    <w:p/>
+    <w:p>
+      <w:r>
+        <w:drawing>
+          <wp:anchor distT="0" distB="0" distL="114300" distR="114300" simplePos="0" relativeHeight="251666432" behindDoc="0" locked="0" layoutInCell="1" allowOverlap="1" wp14:anchorId="650C6843" wp14:editId="3B690459">
+            <wp:simplePos x="0" y="0"/>
+            <wp:positionH relativeFrom="column">
+              <wp:posOffset>1318260</wp:posOffset>
+            </wp:positionH>
+            <wp:positionV relativeFrom="paragraph">
+              <wp:posOffset>8679</wp:posOffset>
+            </wp:positionV>
+            <wp:extent cx="2834886" cy="1493649"/>
+            <wp:effectExtent l="0" t="0" r="3810" b="0"/>
+            <wp:wrapSquare wrapText="bothSides"/>
+            <wp:docPr id="112271767" name="Image 1"/>
+            <wp:cNvGraphicFramePr>
+              <a:graphicFrameLocks xmlns:a="http://schemas.openxmlformats.org/drawingml/2006/main" noChangeAspect="1"/>
+            </wp:cNvGraphicFramePr>
+            <a:graphic xmlns:a="http://schemas.openxmlformats.org/drawingml/2006/main">
+              <a:graphicData uri="http://schemas.openxmlformats.org/drawingml/2006/picture">
+                <pic:pic xmlns:pic="http://schemas.openxmlformats.org/drawingml/2006/picture">
+                  <pic:nvPicPr>
+                    <pic:cNvPr id="112271767" name=""/>
+                    <pic:cNvPicPr/>
+                  </pic:nvPicPr>
+                  <pic:blipFill>
+                    <a:blip r:embed="rId18">
+                      <a:extLst>
+                        <a:ext uri="{28A0092B-C50C-407E-A947-70E740481C1C}">
+                          <a14:useLocalDpi xmlns:a14="http://schemas.microsoft.com/office/drawing/2010/main" val="0"/>
+                        </a:ext>
+                      </a:extLst>
+                    </a:blip>
+                    <a:stretch>
+                      <a:fillRect/>
+                    </a:stretch>
+                  </pic:blipFill>
+                  <pic:spPr>
+                    <a:xfrm>
+                      <a:off x="0" y="0"/>
+                      <a:ext cx="2834886" cy="1493649"/>
+                    </a:xfrm>
+                    <a:prstGeom prst="rect">
+                      <a:avLst/>
+                    </a:prstGeom>
+                  </pic:spPr>
+                </pic:pic>
+              </a:graphicData>
+            </a:graphic>
+          </wp:anchor>
+        </w:drawing>
+      </w:r>
+    </w:p>
+    <w:p/>
+    <w:p/>
+    <w:p/>
+    <w:p/>
+    <w:p/>
+    <w:p>
+      <w:pPr>
+        <w:jc w:val="center"/>
+      </w:pPr>
+      <w:r>
+        <w:drawing>
+          <wp:inline distT="0" distB="0" distL="0" distR="0" wp14:anchorId="7887D05C" wp14:editId="15A9511A">
+            <wp:extent cx="4385733" cy="2632310"/>
+            <wp:effectExtent l="0" t="0" r="0" b="0"/>
+            <wp:docPr id="1942461332" name="Image 1"/>
+            <wp:cNvGraphicFramePr>
+              <a:graphicFrameLocks xmlns:a="http://schemas.openxmlformats.org/drawingml/2006/main" noChangeAspect="1"/>
+            </wp:cNvGraphicFramePr>
+            <a:graphic xmlns:a="http://schemas.openxmlformats.org/drawingml/2006/main">
+              <a:graphicData uri="http://schemas.openxmlformats.org/drawingml/2006/picture">
+                <pic:pic xmlns:pic="http://schemas.openxmlformats.org/drawingml/2006/picture">
+                  <pic:nvPicPr>
+                    <pic:cNvPr id="1942461332" name=""/>
+                    <pic:cNvPicPr/>
+                  </pic:nvPicPr>
+                  <pic:blipFill>
+                    <a:blip r:embed="rId19"/>
+                    <a:stretch>
+                      <a:fillRect/>
+                    </a:stretch>
+                  </pic:blipFill>
+                  <pic:spPr>
+                    <a:xfrm>
+                      <a:off x="0" y="0"/>
+                      <a:ext cx="4407337" cy="2645277"/>
+                    </a:xfrm>
+                    <a:prstGeom prst="rect">
+                      <a:avLst/>
+                    </a:prstGeom>
+                  </pic:spPr>
+                </pic:pic>
+              </a:graphicData>
+            </a:graphic>
+          </wp:inline>
+        </w:drawing>
+      </w:r>
+      <w:r>
+        <w:drawing>
+          <wp:inline distT="0" distB="0" distL="0" distR="0" wp14:anchorId="4DC02F8F" wp14:editId="38D13174">
+            <wp:extent cx="4405149" cy="3589866"/>
+            <wp:effectExtent l="0" t="0" r="0" b="0"/>
+            <wp:docPr id="1262525261" name="Image 1"/>
+            <wp:cNvGraphicFramePr>
+              <a:graphicFrameLocks xmlns:a="http://schemas.openxmlformats.org/drawingml/2006/main" noChangeAspect="1"/>
+            </wp:cNvGraphicFramePr>
+            <a:graphic xmlns:a="http://schemas.openxmlformats.org/drawingml/2006/main">
+              <a:graphicData uri="http://schemas.openxmlformats.org/drawingml/2006/picture">
+                <pic:pic xmlns:pic="http://schemas.openxmlformats.org/drawingml/2006/picture">
+                  <pic:nvPicPr>
+                    <pic:cNvPr id="1262525261" name=""/>
+                    <pic:cNvPicPr/>
+                  </pic:nvPicPr>
+                  <pic:blipFill>
+                    <a:blip r:embed="rId20"/>
+                    <a:stretch>
+                      <a:fillRect/>
+                    </a:stretch>
+                  </pic:blipFill>
+                  <pic:spPr>
+                    <a:xfrm>
+                      <a:off x="0" y="0"/>
+                      <a:ext cx="4407848" cy="3592065"/>
+                    </a:xfrm>
+                    <a:prstGeom prst="rect">
+                      <a:avLst/>
+                    </a:prstGeom>
+                  </pic:spPr>
+                </pic:pic>
+              </a:graphicData>
+            </a:graphic>
+          </wp:inline>
+        </w:drawing>
+      </w:r>
+    </w:p>
     <w:sectPr>
       <w:pgSz w:w="11906" w:h="16838"/>
       <w:pgMar w:top="1417" w:right="1417" w:bottom="1417" w:left="1417" w:header="708" w:footer="708" w:gutter="0"/>

</xml_diff>